<commit_message>
made small change to add supp reference to JMS paper
</commit_message>
<xml_diff>
--- a/Docs/ICES_JMS/MainDocument.docx
+++ b/Docs/ICES_JMS/MainDocument.docx
@@ -203,7 +203,25 @@
           <w:sz w:val="28"/>
           <w:szCs w:val="28"/>
         </w:rPr>
-        <w:t xml:space="preserve">, Valentina Staneva </w:t>
+        <w:t xml:space="preserve">, Valentina </w:t>
+      </w:r>
+      <w:proofErr w:type="spellStart"/>
+      <w:r>
+        <w:rPr>
+          <w:rFonts w:ascii="Times New Roman" w:hAnsi="Times New Roman" w:cs="Times New Roman"/>
+          <w:sz w:val="28"/>
+          <w:szCs w:val="28"/>
+        </w:rPr>
+        <w:t>Staneva</w:t>
+      </w:r>
+      <w:proofErr w:type="spellEnd"/>
+      <w:r>
+        <w:rPr>
+          <w:rFonts w:ascii="Times New Roman" w:hAnsi="Times New Roman" w:cs="Times New Roman"/>
+          <w:sz w:val="28"/>
+          <w:szCs w:val="28"/>
+        </w:rPr>
+        <w:t xml:space="preserve"> </w:t>
       </w:r>
       <w:r>
         <w:rPr>
@@ -3141,7 +3159,21 @@
         <w:rPr>
           <w:rFonts w:ascii="Times New Roman" w:hAnsi="Times New Roman" w:cs="Times New Roman"/>
         </w:rPr>
-        <w:t xml:space="preserve">with the Alaska Department of Fish and Game Lower Yukon Test Fishery (LYTF), Orutsararmiut </w:t>
+        <w:t xml:space="preserve">with the Alaska Department of Fish and Game Lower Yukon Test Fishery (LYTF), </w:t>
+      </w:r>
+      <w:proofErr w:type="spellStart"/>
+      <w:r>
+        <w:rPr>
+          <w:rFonts w:ascii="Times New Roman" w:hAnsi="Times New Roman" w:cs="Times New Roman"/>
+        </w:rPr>
+        <w:t>Orutsararmiut</w:t>
+      </w:r>
+      <w:proofErr w:type="spellEnd"/>
+      <w:r>
+        <w:rPr>
+          <w:rFonts w:ascii="Times New Roman" w:hAnsi="Times New Roman" w:cs="Times New Roman"/>
+        </w:rPr>
+        <w:t xml:space="preserve"> </w:t>
       </w:r>
       <w:r>
         <w:rPr>
@@ -3226,7 +3258,21 @@
         <w:rPr>
           <w:rFonts w:ascii="Times New Roman" w:hAnsi="Times New Roman" w:cs="Times New Roman"/>
         </w:rPr>
-        <w:t xml:space="preserve"> isomet saw</w:t>
+        <w:t xml:space="preserve"> </w:t>
+      </w:r>
+      <w:proofErr w:type="spellStart"/>
+      <w:r>
+        <w:rPr>
+          <w:rFonts w:ascii="Times New Roman" w:hAnsi="Times New Roman" w:cs="Times New Roman"/>
+        </w:rPr>
+        <w:t>isomet</w:t>
+      </w:r>
+      <w:proofErr w:type="spellEnd"/>
+      <w:r>
+        <w:rPr>
+          <w:rFonts w:ascii="Times New Roman" w:hAnsi="Times New Roman" w:cs="Times New Roman"/>
+        </w:rPr>
+        <w:t xml:space="preserve"> saw</w:t>
       </w:r>
       <w:r>
         <w:rPr>
@@ -3305,7 +3351,21 @@
         <w:rPr>
           <w:rFonts w:ascii="Times New Roman" w:hAnsi="Times New Roman" w:cs="Times New Roman"/>
         </w:rPr>
-        <w:t xml:space="preserve"> analyzed using Laser Ablation Inductively Coupled Plasma Mass Spectrometry (LA-ICP-MS) at the University of Utah Strontium Metals Lab, with the exception of 2022 Kuskokwim samples</w:t>
+        <w:t xml:space="preserve"> analyzed using Laser Ablation Inductively Coupled Plasma Mass Spectrometry (LA-ICP-MS) at the University of Utah Strontium Metals Lab, </w:t>
+      </w:r>
+      <w:proofErr w:type="gramStart"/>
+      <w:r>
+        <w:rPr>
+          <w:rFonts w:ascii="Times New Roman" w:hAnsi="Times New Roman" w:cs="Times New Roman"/>
+        </w:rPr>
+        <w:t>with the exception of</w:t>
+      </w:r>
+      <w:proofErr w:type="gramEnd"/>
+      <w:r>
+        <w:rPr>
+          <w:rFonts w:ascii="Times New Roman" w:hAnsi="Times New Roman" w:cs="Times New Roman"/>
+        </w:rPr>
+        <w:t xml:space="preserve"> 2022 Kuskokwim samples</w:t>
       </w:r>
       <w:r>
         <w:rPr>
@@ -3535,7 +3595,21 @@
         <w:rPr>
           <w:rFonts w:ascii="Times New Roman" w:hAnsi="Times New Roman" w:cs="Times New Roman"/>
         </w:rPr>
-        <w:t xml:space="preserve">. Each individual with available genetic data was </w:t>
+        <w:t xml:space="preserve">. </w:t>
+      </w:r>
+      <w:proofErr w:type="gramStart"/>
+      <w:r>
+        <w:rPr>
+          <w:rFonts w:ascii="Times New Roman" w:hAnsi="Times New Roman" w:cs="Times New Roman"/>
+        </w:rPr>
+        <w:t>Each individual</w:t>
+      </w:r>
+      <w:proofErr w:type="gramEnd"/>
+      <w:r>
+        <w:rPr>
+          <w:rFonts w:ascii="Times New Roman" w:hAnsi="Times New Roman" w:cs="Times New Roman"/>
+        </w:rPr>
+        <w:t xml:space="preserve"> with available genetic data was </w:t>
       </w:r>
       <w:r>
         <w:rPr>
@@ -3796,7 +3870,21 @@
         <w:rPr>
           <w:rFonts w:ascii="Times New Roman" w:hAnsi="Times New Roman" w:cs="Times New Roman"/>
         </w:rPr>
-        <w:t>the start of the laser ablation transect and quality of the core signal varied among samples and years. T</w:t>
+        <w:t xml:space="preserve">the start of the laser ablation </w:t>
+      </w:r>
+      <w:proofErr w:type="gramStart"/>
+      <w:r>
+        <w:rPr>
+          <w:rFonts w:ascii="Times New Roman" w:hAnsi="Times New Roman" w:cs="Times New Roman"/>
+        </w:rPr>
+        <w:t>transect</w:t>
+      </w:r>
+      <w:proofErr w:type="gramEnd"/>
+      <w:r>
+        <w:rPr>
+          <w:rFonts w:ascii="Times New Roman" w:hAnsi="Times New Roman" w:cs="Times New Roman"/>
+        </w:rPr>
+        <w:t xml:space="preserve"> and quality of the core signal varied among samples and years. T</w:t>
       </w:r>
       <w:r>
         <w:rPr>
@@ -3804,12 +3892,14 @@
         </w:rPr>
         <w:t xml:space="preserve">herefore, to </w:t>
       </w:r>
+      <w:proofErr w:type="spellStart"/>
       <w:r>
         <w:rPr>
           <w:rFonts w:ascii="Times New Roman" w:hAnsi="Times New Roman" w:cs="Times New Roman"/>
         </w:rPr>
         <w:t>maximise</w:t>
       </w:r>
+      <w:proofErr w:type="spellEnd"/>
       <w:r>
         <w:rPr>
           <w:rFonts w:ascii="Times New Roman" w:hAnsi="Times New Roman" w:cs="Times New Roman"/>
@@ -3994,7 +4084,21 @@
         <w:rPr>
           <w:rFonts w:ascii="Times New Roman" w:hAnsi="Times New Roman" w:cs="Times New Roman"/>
         </w:rPr>
-        <w:t xml:space="preserve">amples with significant error (i.e large cracks) </w:t>
+        <w:t>amples with significant error (</w:t>
+      </w:r>
+      <w:proofErr w:type="spellStart"/>
+      <w:r>
+        <w:rPr>
+          <w:rFonts w:ascii="Times New Roman" w:hAnsi="Times New Roman" w:cs="Times New Roman"/>
+        </w:rPr>
+        <w:t>i.e</w:t>
+      </w:r>
+      <w:proofErr w:type="spellEnd"/>
+      <w:r>
+        <w:rPr>
+          <w:rFonts w:ascii="Times New Roman" w:hAnsi="Times New Roman" w:cs="Times New Roman"/>
+        </w:rPr>
+        <w:t xml:space="preserve"> large cracks) </w:t>
       </w:r>
       <w:r>
         <w:rPr>
@@ -4161,12 +4265,14 @@
         </w:rPr>
         <w:t xml:space="preserve">The GAM was fitted using thin plate regression and penalized iteratively re-weighted least squares (P-IRLS) to </w:t>
       </w:r>
+      <w:proofErr w:type="spellStart"/>
       <w:r>
         <w:rPr>
           <w:rFonts w:ascii="Times New Roman" w:hAnsi="Times New Roman" w:cs="Times New Roman"/>
         </w:rPr>
         <w:t>maximise</w:t>
       </w:r>
+      <w:proofErr w:type="spellEnd"/>
       <w:r>
         <w:rPr>
           <w:rFonts w:ascii="Times New Roman" w:hAnsi="Times New Roman" w:cs="Times New Roman"/>
@@ -4192,12 +4298,14 @@
         </w:rPr>
         <w:t xml:space="preserve">to </w:t>
       </w:r>
+      <w:proofErr w:type="spellStart"/>
       <w:r>
         <w:rPr>
           <w:rFonts w:ascii="Times New Roman" w:hAnsi="Times New Roman" w:cs="Times New Roman"/>
         </w:rPr>
         <w:t>minimise</w:t>
       </w:r>
+      <w:proofErr w:type="spellEnd"/>
       <w:r>
         <w:rPr>
           <w:rFonts w:ascii="Times New Roman" w:hAnsi="Times New Roman" w:cs="Times New Roman"/>
@@ -4276,8 +4384,16 @@
         <w:rPr>
           <w:rFonts w:ascii="Times New Roman" w:hAnsi="Times New Roman" w:cs="Times New Roman"/>
         </w:rPr>
-        <w:t>series for each individual</w:t>
-      </w:r>
+        <w:t xml:space="preserve">series for </w:t>
+      </w:r>
+      <w:proofErr w:type="gramStart"/>
+      <w:r>
+        <w:rPr>
+          <w:rFonts w:ascii="Times New Roman" w:hAnsi="Times New Roman" w:cs="Times New Roman"/>
+        </w:rPr>
+        <w:t>each individual</w:t>
+      </w:r>
+      <w:proofErr w:type="gramEnd"/>
       <w:r>
         <w:rPr>
           <w:rFonts w:ascii="Times New Roman" w:hAnsi="Times New Roman" w:cs="Times New Roman"/>
@@ -4296,12 +4412,14 @@
         </w:rPr>
         <w:t xml:space="preserve">defined as the average length of </w:t>
       </w:r>
+      <w:proofErr w:type="spellStart"/>
       <w:r>
         <w:rPr>
           <w:rFonts w:ascii="Times New Roman" w:hAnsi="Times New Roman" w:cs="Times New Roman"/>
         </w:rPr>
         <w:t>all time</w:t>
       </w:r>
+      <w:proofErr w:type="spellEnd"/>
       <w:r>
         <w:rPr>
           <w:rFonts w:ascii="Times New Roman" w:hAnsi="Times New Roman" w:cs="Times New Roman"/>
@@ -4989,6 +5107,7 @@
         </w:rPr>
         <w:t>. The Random Forest model was configured with 500 trees, and the number of predictors randomly sampled at each split (</w:t>
       </w:r>
+      <w:proofErr w:type="spellStart"/>
       <w:r>
         <w:rPr>
           <w:rStyle w:val="HTMLCode"/>
@@ -4998,6 +5117,7 @@
         </w:rPr>
         <w:t>mtry</w:t>
       </w:r>
+      <w:proofErr w:type="spellEnd"/>
       <w:r>
         <w:rPr>
           <w:rFonts w:ascii="Times New Roman" w:hAnsi="Times New Roman" w:cs="Times New Roman"/>
@@ -5703,10 +5823,18 @@
         <w:t>60% to 90%.</w:t>
       </w:r>
       <w:r>
-        <w:t xml:space="preserve"> For a given confidence threshold, we calculated the number of individuals assigned to a </w:t>
-      </w:r>
-      <w:r>
-        <w:t xml:space="preserve">the correct </w:t>
+        <w:t xml:space="preserve"> For a given confidence threshold, we calculated the number of individuals assigned to </w:t>
+      </w:r>
+      <w:proofErr w:type="gramStart"/>
+      <w:r>
+        <w:t xml:space="preserve">a </w:t>
+      </w:r>
+      <w:r>
+        <w:t>the</w:t>
+      </w:r>
+      <w:proofErr w:type="gramEnd"/>
+      <w:r>
+        <w:t xml:space="preserve"> correct </w:t>
       </w:r>
       <w:r>
         <w:t>class with a calibrated probability value at or above the given threshold</w:t>
@@ -6027,20 +6155,28 @@
         <w:rPr>
           <w:rFonts w:ascii="Times New Roman" w:hAnsi="Times New Roman" w:cs="Times New Roman"/>
         </w:rPr>
-        <w:t xml:space="preserve"> (</w:t>
-      </w:r>
-      <w:r>
-        <w:rPr>
-          <w:rFonts w:ascii="Times New Roman" w:hAnsi="Times New Roman" w:cs="Times New Roman"/>
-        </w:rPr>
         <w:t xml:space="preserve"> </w:t>
       </w:r>
+      <w:proofErr w:type="gramStart"/>
+      <w:r>
+        <w:rPr>
+          <w:rFonts w:ascii="Times New Roman" w:hAnsi="Times New Roman" w:cs="Times New Roman"/>
+        </w:rPr>
+        <w:t>(</w:t>
+      </w:r>
+      <w:r>
+        <w:rPr>
+          <w:rFonts w:ascii="Times New Roman" w:hAnsi="Times New Roman" w:cs="Times New Roman"/>
+        </w:rPr>
+        <w:t xml:space="preserve"> </w:t>
+      </w:r>
       <w:r>
         <w:rPr>
           <w:rFonts w:ascii="Times New Roman" w:hAnsi="Times New Roman" w:cs="Times New Roman"/>
         </w:rPr>
         <w:t>0.714</w:t>
       </w:r>
+      <w:proofErr w:type="gramEnd"/>
       <w:r>
         <w:rPr>
           <w:rFonts w:ascii="Times New Roman" w:hAnsi="Times New Roman" w:cs="Times New Roman"/>
@@ -6053,6 +6189,7 @@
         </w:rPr>
         <w:t>0.709</w:t>
       </w:r>
+      <w:proofErr w:type="gramStart"/>
       <w:r>
         <w:rPr>
           <w:rFonts w:ascii="Times New Roman" w:hAnsi="Times New Roman" w:cs="Times New Roman"/>
@@ -6071,6 +6208,7 @@
         </w:rPr>
         <w:t xml:space="preserve"> 0.707</w:t>
       </w:r>
+      <w:proofErr w:type="gramEnd"/>
       <w:r>
         <w:rPr>
           <w:rFonts w:ascii="Times New Roman" w:hAnsi="Times New Roman" w:cs="Times New Roman"/>
@@ -6117,7 +6255,21 @@
         <w:rPr>
           <w:rFonts w:ascii="Times New Roman" w:hAnsi="Times New Roman" w:cs="Times New Roman"/>
         </w:rPr>
-        <w:t xml:space="preserve"> Notably, many Yukon fish assigned to the CWAK region appeared to have a much less pronounced increase in ⁸⁷Sr/⁸⁶Sr, which is consistent with less residence time in the mainstem as a result of a much shorter distance from their natal origin region to the ocean. </w:t>
+        <w:t xml:space="preserve"> Notably, many Yukon fish assigned to the CWAK region appeared to have a much less pronounced increase in ⁸⁷Sr/⁸⁶Sr, which is consistent with less residence time in the mainstem </w:t>
+      </w:r>
+      <w:proofErr w:type="gramStart"/>
+      <w:r>
+        <w:rPr>
+          <w:rFonts w:ascii="Times New Roman" w:hAnsi="Times New Roman" w:cs="Times New Roman"/>
+        </w:rPr>
+        <w:t>as a result of</w:t>
+      </w:r>
+      <w:proofErr w:type="gramEnd"/>
+      <w:r>
+        <w:rPr>
+          <w:rFonts w:ascii="Times New Roman" w:hAnsi="Times New Roman" w:cs="Times New Roman"/>
+        </w:rPr>
+        <w:t xml:space="preserve"> a much shorter distance from their natal origin region to the ocean. </w:t>
       </w:r>
       <w:r>
         <w:rPr>
@@ -6190,13 +6342,27 @@
         <w:rPr>
           <w:rFonts w:ascii="Times New Roman" w:hAnsi="Times New Roman" w:cs="Times New Roman"/>
         </w:rPr>
-        <w:t xml:space="preserve">a) </w:t>
-      </w:r>
-      <w:r>
-        <w:rPr>
-          <w:rFonts w:ascii="Times New Roman" w:hAnsi="Times New Roman" w:cs="Times New Roman"/>
-        </w:rPr>
-        <w:t xml:space="preserve">, which is expected given that all individuals in this subset have very similar natal origin values. </w:t>
+        <w:t>a</w:t>
+      </w:r>
+      <w:proofErr w:type="gramStart"/>
+      <w:r>
+        <w:rPr>
+          <w:rFonts w:ascii="Times New Roman" w:hAnsi="Times New Roman" w:cs="Times New Roman"/>
+        </w:rPr>
+        <w:t xml:space="preserve">) </w:t>
+      </w:r>
+      <w:r>
+        <w:rPr>
+          <w:rFonts w:ascii="Times New Roman" w:hAnsi="Times New Roman" w:cs="Times New Roman"/>
+        </w:rPr>
+        <w:t>,</w:t>
+      </w:r>
+      <w:proofErr w:type="gramEnd"/>
+      <w:r>
+        <w:rPr>
+          <w:rFonts w:ascii="Times New Roman" w:hAnsi="Times New Roman" w:cs="Times New Roman"/>
+        </w:rPr>
+        <w:t xml:space="preserve"> which is expected given that all individuals in this subset have very similar natal origin values. </w:t>
       </w:r>
     </w:p>
     <w:p>
@@ -6279,8 +6445,16 @@
         <w:rPr>
           <w:rFonts w:ascii="Times New Roman" w:hAnsi="Times New Roman" w:cs="Times New Roman"/>
         </w:rPr>
-        <w:t xml:space="preserve"> was</w:t>
-      </w:r>
+        <w:t xml:space="preserve"> </w:t>
+      </w:r>
+      <w:proofErr w:type="gramStart"/>
+      <w:r>
+        <w:rPr>
+          <w:rFonts w:ascii="Times New Roman" w:hAnsi="Times New Roman" w:cs="Times New Roman"/>
+        </w:rPr>
+        <w:t>was</w:t>
+      </w:r>
+      <w:proofErr w:type="gramEnd"/>
       <w:r>
         <w:rPr>
           <w:rFonts w:ascii="Times New Roman" w:hAnsi="Times New Roman" w:cs="Times New Roman"/>
@@ -6631,7 +6805,21 @@
         <w:rPr>
           <w:rFonts w:ascii="Times New Roman" w:hAnsi="Times New Roman" w:cs="Times New Roman"/>
         </w:rPr>
-        <w:t xml:space="preserve"> the most frequent misclassification was Yukon fish predicted to have been Kuskokwim (8.8% of Yukon fish), however this represented only one additional individual misclassified (9 in the total analysis vs</w:t>
+        <w:t xml:space="preserve"> the most frequent misclassification was Yukon fish predicted to have been Kuskokwim (8.8% of Yukon fish</w:t>
+      </w:r>
+      <w:proofErr w:type="gramStart"/>
+      <w:r>
+        <w:rPr>
+          <w:rFonts w:ascii="Times New Roman" w:hAnsi="Times New Roman" w:cs="Times New Roman"/>
+        </w:rPr>
+        <w:t>),</w:t>
+      </w:r>
+      <w:proofErr w:type="gramEnd"/>
+      <w:r>
+        <w:rPr>
+          <w:rFonts w:ascii="Times New Roman" w:hAnsi="Times New Roman" w:cs="Times New Roman"/>
+        </w:rPr>
+        <w:t xml:space="preserve"> however this represented only one additional individual misclassified (9 in the total analysis vs</w:t>
       </w:r>
       <w:r>
         <w:rPr>
@@ -6661,7 +6849,35 @@
         <w:rPr>
           <w:rFonts w:ascii="Times New Roman" w:hAnsi="Times New Roman" w:cs="Times New Roman"/>
         </w:rPr>
-        <w:t xml:space="preserve">Classification accuracy within the CWAK reporting group, which includes the Kuskokwim, Nushagak, and Lower Yukon regions was 90.0%. Classification accuracy for regions in our dataset not within CWAK was 97.9%. Yukon classification accuracy for those within the CWAK group fell to 73.3%. However, it should be noted that the sample size of CWAK Yukon individuals was significantly lower than other groups ( n = 29 ) , resulting in a more pronounced impact to class- specific accuracy from misassignment to relatively few individuals. </w:t>
+        <w:t xml:space="preserve">Classification accuracy within the CWAK reporting group, which includes the Kuskokwim, Nushagak, and Lower Yukon regions was 90.0%. Classification accuracy for regions in our dataset not within CWAK was 97.9%. Yukon classification accuracy for those within the CWAK group fell to 73.3%. However, it should be noted that the sample size of CWAK Yukon individuals was significantly lower than other groups </w:t>
+      </w:r>
+      <w:proofErr w:type="gramStart"/>
+      <w:r>
+        <w:rPr>
+          <w:rFonts w:ascii="Times New Roman" w:hAnsi="Times New Roman" w:cs="Times New Roman"/>
+        </w:rPr>
+        <w:t>( n</w:t>
+      </w:r>
+      <w:proofErr w:type="gramEnd"/>
+      <w:r>
+        <w:rPr>
+          <w:rFonts w:ascii="Times New Roman" w:hAnsi="Times New Roman" w:cs="Times New Roman"/>
+        </w:rPr>
+        <w:t xml:space="preserve"> = </w:t>
+      </w:r>
+      <w:proofErr w:type="gramStart"/>
+      <w:r>
+        <w:rPr>
+          <w:rFonts w:ascii="Times New Roman" w:hAnsi="Times New Roman" w:cs="Times New Roman"/>
+        </w:rPr>
+        <w:t>29 )</w:t>
+      </w:r>
+      <w:proofErr w:type="gramEnd"/>
+      <w:r>
+        <w:rPr>
+          <w:rFonts w:ascii="Times New Roman" w:hAnsi="Times New Roman" w:cs="Times New Roman"/>
+        </w:rPr>
+        <w:t xml:space="preserve"> , resulting in a more pronounced impact to class- specific accuracy from misassignment to relatively few individuals. </w:t>
       </w:r>
     </w:p>
     <w:p>
@@ -7307,19 +7523,7 @@
         <w:rPr>
           <w:rFonts w:ascii="Times New Roman" w:hAnsi="Times New Roman" w:cs="Times New Roman"/>
         </w:rPr>
-        <w:t>u</w:t>
-      </w:r>
-      <w:r>
-        <w:rPr>
-          <w:rFonts w:ascii="Times New Roman" w:hAnsi="Times New Roman" w:cs="Times New Roman"/>
-        </w:rPr>
-        <w:t xml:space="preserve">ure </w:t>
-      </w:r>
-      <w:r>
-        <w:rPr>
-          <w:rFonts w:ascii="Times New Roman" w:hAnsi="Times New Roman" w:cs="Times New Roman"/>
-        </w:rPr>
-        <w:t>2</w:t>
+        <w:t>Figure 2</w:t>
       </w:r>
       <w:r>
         <w:rPr>
@@ -7379,7 +7583,21 @@
         <w:rPr>
           <w:rFonts w:ascii="Times New Roman" w:hAnsi="Times New Roman" w:cs="Times New Roman"/>
         </w:rPr>
-        <w:t xml:space="preserve">migration through the enriched mainstem tributary (i.e Figure </w:t>
+        <w:t>migration through the enriched mainstem tributary (</w:t>
+      </w:r>
+      <w:proofErr w:type="spellStart"/>
+      <w:r>
+        <w:rPr>
+          <w:rFonts w:ascii="Times New Roman" w:hAnsi="Times New Roman" w:cs="Times New Roman"/>
+        </w:rPr>
+        <w:t>i.e</w:t>
+      </w:r>
+      <w:proofErr w:type="spellEnd"/>
+      <w:r>
+        <w:rPr>
+          <w:rFonts w:ascii="Times New Roman" w:hAnsi="Times New Roman" w:cs="Times New Roman"/>
+        </w:rPr>
+        <w:t xml:space="preserve"> Figure </w:t>
       </w:r>
       <w:r>
         <w:rPr>
@@ -7458,6 +7676,20 @@
         <w:rPr>
           <w:rFonts w:ascii="Times New Roman" w:hAnsi="Times New Roman" w:cs="Times New Roman"/>
         </w:rPr>
+        <w:t xml:space="preserve"> (Supp. Figure </w:t>
+      </w:r>
+      <w:proofErr w:type="gramStart"/>
+      <w:r>
+        <w:rPr>
+          <w:rFonts w:ascii="Times New Roman" w:hAnsi="Times New Roman" w:cs="Times New Roman"/>
+        </w:rPr>
+        <w:t>2 )</w:t>
+      </w:r>
+      <w:proofErr w:type="gramEnd"/>
+      <w:r>
+        <w:rPr>
+          <w:rFonts w:ascii="Times New Roman" w:hAnsi="Times New Roman" w:cs="Times New Roman"/>
+        </w:rPr>
         <w:t xml:space="preserve">. </w:t>
       </w:r>
       <w:r>
@@ -7542,7 +7774,14 @@
         <w:rPr>
           <w:rFonts w:ascii="Times New Roman" w:hAnsi="Times New Roman" w:cs="Times New Roman"/>
         </w:rPr>
-        <w:t>methods ( 90% confidence threshold on the restricted dataset</w:t>
+        <w:t xml:space="preserve">methods (90% confidence threshold on the restricted </w:t>
+      </w:r>
+      <w:proofErr w:type="gramStart"/>
+      <w:r>
+        <w:rPr>
+          <w:rFonts w:ascii="Times New Roman" w:hAnsi="Times New Roman" w:cs="Times New Roman"/>
+        </w:rPr>
+        <w:t>dataset</w:t>
       </w:r>
       <w:r>
         <w:rPr>
@@ -7554,7 +7793,14 @@
         <w:rPr>
           <w:rFonts w:ascii="Times New Roman" w:hAnsi="Times New Roman" w:cs="Times New Roman"/>
         </w:rPr>
-        <w:t>) we achieved 78% classification accuracy across all three datasets.</w:t>
+        <w:t>)</w:t>
+      </w:r>
+      <w:proofErr w:type="gramEnd"/>
+      <w:r>
+        <w:rPr>
+          <w:rFonts w:ascii="Times New Roman" w:hAnsi="Times New Roman" w:cs="Times New Roman"/>
+        </w:rPr>
+        <w:t xml:space="preserve"> we achieved 78% classification accuracy across all three datasets.</w:t>
       </w:r>
       <w:r>
         <w:rPr>
@@ -7599,7 +7845,21 @@
         <w:rPr>
           <w:rFonts w:ascii="Times New Roman" w:hAnsi="Times New Roman" w:cs="Times New Roman"/>
         </w:rPr>
-        <w:t xml:space="preserve">from the Yukon river </w:t>
+        <w:t xml:space="preserve">from the </w:t>
+      </w:r>
+      <w:proofErr w:type="gramStart"/>
+      <w:r>
+        <w:rPr>
+          <w:rFonts w:ascii="Times New Roman" w:hAnsi="Times New Roman" w:cs="Times New Roman"/>
+        </w:rPr>
+        <w:t>Yukon river</w:t>
+      </w:r>
+      <w:proofErr w:type="gramEnd"/>
+      <w:r>
+        <w:rPr>
+          <w:rFonts w:ascii="Times New Roman" w:hAnsi="Times New Roman" w:cs="Times New Roman"/>
+        </w:rPr>
+        <w:t xml:space="preserve"> </w:t>
       </w:r>
       <w:r>
         <w:rPr>
@@ -7841,7 +8101,15 @@
         <w:t xml:space="preserve">Our dataset is unusually large for its type and includes samples collected across several years and from nearly all parts of the sampled watersheds. As such, we expect it to be broadly representative of the natural variability among years, and that the model presented here will generalize well to new years of data. However, due to sample size constraints we did not include a true validation set from a year excluded from the training and testing data, leaving open the possibility that some degree of overfitting to this dataset could affect assignment accuracy for unseen years. </w:t>
       </w:r>
       <w:r>
-        <w:t xml:space="preserve">During exploratory analyses, we conducted a preliminary cross-year validation in which one year of Yukon data was withheld in each run and used as a validation set. Classification accuracy across years was generally consistent with testing performance, except for 2019, which performed moderately worse, possibly due to differences in sample preparation or data quality. While these preliminary results were not included in the final analysis they support the potential for this model to generalize to new years of data, </w:t>
+        <w:t xml:space="preserve">During exploratory analyses, we conducted a preliminary cross-year validation in which one year of Yukon data was withheld in each run and used as a validation set. Classification accuracy across years was generally consistent with testing performance, except for 2019, which performed moderately worse, possibly due to differences in sample preparation or data quality. While these preliminary results were not included in the final </w:t>
+      </w:r>
+      <w:proofErr w:type="gramStart"/>
+      <w:r>
+        <w:t>analysis</w:t>
+      </w:r>
+      <w:proofErr w:type="gramEnd"/>
+      <w:r>
+        <w:t xml:space="preserve"> they support the potential for this model to generalize to new years of data, </w:t>
       </w:r>
       <w:r>
         <w:t xml:space="preserve">which we plan to further evaluate as additional, currently unprocessed years of otolith data become available. </w:t>
@@ -7903,9 +8171,11 @@
       <w:r>
         <w:t xml:space="preserve">, or deep learning approaches which can accommodate variation in time-series length and </w:t>
       </w:r>
+      <w:proofErr w:type="spellStart"/>
       <w:r>
         <w:t>minimise</w:t>
       </w:r>
+      <w:proofErr w:type="spellEnd"/>
       <w:r>
         <w:t xml:space="preserve"> the need for preprocessing</w:t>
       </w:r>
@@ -8309,12 +8579,21 @@
         </w:rPr>
         <w:t>and the </w:t>
       </w:r>
+      <w:proofErr w:type="spellStart"/>
       <w:r>
         <w:rPr>
           <w:color w:val="222222"/>
           <w:shd w:val="clear" w:color="auto" w:fill="FFFFFF"/>
         </w:rPr>
-        <w:t>Orutsararmiut Native Council</w:t>
+        <w:t>Orutsararmiut</w:t>
+      </w:r>
+      <w:proofErr w:type="spellEnd"/>
+      <w:r>
+        <w:rPr>
+          <w:color w:val="222222"/>
+          <w:shd w:val="clear" w:color="auto" w:fill="FFFFFF"/>
+        </w:rPr>
+        <w:t xml:space="preserve"> Native Council</w:t>
       </w:r>
       <w:r>
         <w:rPr>
@@ -8563,7 +8842,21 @@
         <w:rPr>
           <w:rFonts w:ascii="Times New Roman" w:hAnsi="Times New Roman" w:cs="Times New Roman"/>
         </w:rPr>
-        <w:t xml:space="preserve">formed data analysis and wrote the manuscript. Valentina Staneva provided technical expertise and provided extensive consultation on project direction. Daniel E. Schindler directed the project and analysis, secured funding, and helped develop the manuscript. All authors contributed to editing the final manuscript. </w:t>
+        <w:t xml:space="preserve">formed data analysis and wrote the manuscript. Valentina </w:t>
+      </w:r>
+      <w:proofErr w:type="spellStart"/>
+      <w:r>
+        <w:rPr>
+          <w:rFonts w:ascii="Times New Roman" w:hAnsi="Times New Roman" w:cs="Times New Roman"/>
+        </w:rPr>
+        <w:t>Staneva</w:t>
+      </w:r>
+      <w:proofErr w:type="spellEnd"/>
+      <w:r>
+        <w:rPr>
+          <w:rFonts w:ascii="Times New Roman" w:hAnsi="Times New Roman" w:cs="Times New Roman"/>
+        </w:rPr>
+        <w:t xml:space="preserve"> provided technical expertise and provided extensive consultation on project direction. Daniel E. Schindler directed the project and analysis, secured funding, and helped develop the manuscript. All authors contributed to editing the final manuscript. </w:t>
       </w:r>
     </w:p>
     <w:p>
@@ -9852,6 +10145,1101 @@
         </w:rPr>
         <w:t xml:space="preserve"> </w:t>
       </w:r>
+    </w:p>
+    <w:p>
+      <w:pPr>
+        <w:spacing w:before="100" w:beforeAutospacing="1" w:after="100" w:afterAutospacing="1" w:line="480" w:lineRule="auto"/>
+        <w:ind w:left="720" w:hanging="720"/>
+        <w:outlineLvl w:val="1"/>
+        <w:rPr>
+          <w:rFonts w:ascii="Garamond" w:hAnsi="Garamond"/>
+          <w:sz w:val="22"/>
+          <w:szCs w:val="22"/>
+        </w:rPr>
+      </w:pPr>
+    </w:p>
+    <w:p>
+      <w:pPr>
+        <w:spacing w:before="100" w:beforeAutospacing="1" w:after="100" w:afterAutospacing="1" w:line="480" w:lineRule="auto"/>
+        <w:ind w:left="720" w:hanging="720"/>
+        <w:outlineLvl w:val="1"/>
+        <w:rPr>
+          <w:rFonts w:ascii="Garamond" w:hAnsi="Garamond"/>
+          <w:sz w:val="22"/>
+          <w:szCs w:val="22"/>
+        </w:rPr>
+      </w:pPr>
+    </w:p>
+    <w:p>
+      <w:pPr>
+        <w:spacing w:before="100" w:beforeAutospacing="1" w:after="100" w:afterAutospacing="1" w:line="480" w:lineRule="auto"/>
+        <w:ind w:left="720" w:hanging="720"/>
+        <w:outlineLvl w:val="1"/>
+        <w:rPr>
+          <w:rFonts w:ascii="Garamond" w:hAnsi="Garamond"/>
+          <w:sz w:val="22"/>
+          <w:szCs w:val="22"/>
+        </w:rPr>
+      </w:pPr>
+    </w:p>
+    <w:p>
+      <w:pPr>
+        <w:spacing w:before="100" w:beforeAutospacing="1" w:after="100" w:afterAutospacing="1" w:line="480" w:lineRule="auto"/>
+        <w:ind w:left="720" w:hanging="720"/>
+        <w:outlineLvl w:val="1"/>
+        <w:rPr>
+          <w:rFonts w:ascii="Garamond" w:hAnsi="Garamond"/>
+          <w:sz w:val="22"/>
+          <w:szCs w:val="22"/>
+        </w:rPr>
+      </w:pPr>
+    </w:p>
+    <w:p>
+      <w:pPr>
+        <w:spacing w:before="100" w:beforeAutospacing="1" w:after="100" w:afterAutospacing="1" w:line="480" w:lineRule="auto"/>
+        <w:ind w:left="720" w:hanging="720"/>
+        <w:outlineLvl w:val="1"/>
+        <w:rPr>
+          <w:rFonts w:ascii="Garamond" w:hAnsi="Garamond"/>
+          <w:sz w:val="22"/>
+          <w:szCs w:val="22"/>
+        </w:rPr>
+      </w:pPr>
+    </w:p>
+    <w:p>
+      <w:pPr>
+        <w:rPr>
+          <w:rStyle w:val="CommentReference"/>
+        </w:rPr>
+      </w:pPr>
+      <w:r>
+        <w:rPr>
+          <w:noProof/>
+          <w:sz w:val="16"/>
+          <w:szCs w:val="16"/>
+        </w:rPr>
+        <w:lastRenderedPageBreak/>
+        <w:drawing>
+          <wp:inline distT="0" distB="0" distL="0" distR="0" wp14:anchorId="205ED14F" wp14:editId="70908A5B">
+            <wp:extent cx="4140485" cy="6398842"/>
+            <wp:effectExtent l="0" t="0" r="0" b="2540"/>
+            <wp:docPr id="956025252" name="Picture 1" descr="A map of the river&#10;&#10;AI-generated content may be incorrect."/>
+            <wp:cNvGraphicFramePr>
+              <a:graphicFrameLocks xmlns:a="http://schemas.openxmlformats.org/drawingml/2006/main" noChangeAspect="1"/>
+            </wp:cNvGraphicFramePr>
+            <a:graphic xmlns:a="http://schemas.openxmlformats.org/drawingml/2006/main">
+              <a:graphicData uri="http://schemas.openxmlformats.org/drawingml/2006/picture">
+                <pic:pic xmlns:pic="http://schemas.openxmlformats.org/drawingml/2006/picture">
+                  <pic:nvPicPr>
+                    <pic:cNvPr id="956025252" name="Picture 1" descr="A map of the river&#10;&#10;AI-generated content may be incorrect."/>
+                    <pic:cNvPicPr/>
+                  </pic:nvPicPr>
+                  <pic:blipFill>
+                    <a:blip r:embed="rId7" cstate="print">
+                      <a:extLst>
+                        <a:ext uri="{28A0092B-C50C-407E-A947-70E740481C1C}">
+                          <a14:useLocalDpi xmlns:a14="http://schemas.microsoft.com/office/drawing/2010/main" val="0"/>
+                        </a:ext>
+                      </a:extLst>
+                    </a:blip>
+                    <a:stretch>
+                      <a:fillRect/>
+                    </a:stretch>
+                  </pic:blipFill>
+                  <pic:spPr>
+                    <a:xfrm>
+                      <a:off x="0" y="0"/>
+                      <a:ext cx="4166999" cy="6439818"/>
+                    </a:xfrm>
+                    <a:prstGeom prst="rect">
+                      <a:avLst/>
+                    </a:prstGeom>
+                  </pic:spPr>
+                </pic:pic>
+              </a:graphicData>
+            </a:graphic>
+          </wp:inline>
+        </w:drawing>
+      </w:r>
+    </w:p>
+    <w:p>
+      <w:pPr>
+        <w:rPr>
+          <w:rFonts w:ascii="Times New Roman" w:hAnsi="Times New Roman" w:cs="Times New Roman"/>
+          <w:b/>
+          <w:bCs/>
+        </w:rPr>
+      </w:pPr>
+      <w:r>
+        <w:rPr>
+          <w:rFonts w:ascii="Times New Roman" w:hAnsi="Times New Roman" w:cs="Times New Roman"/>
+          <w:b/>
+          <w:bCs/>
+        </w:rPr>
+        <w:t xml:space="preserve">Figure 1: </w:t>
+      </w:r>
+    </w:p>
+    <w:p>
+      <w:pPr>
+        <w:rPr>
+          <w:rFonts w:ascii="Times New Roman" w:hAnsi="Times New Roman" w:cs="Times New Roman"/>
+        </w:rPr>
+      </w:pPr>
+      <w:r>
+        <w:rPr>
+          <w:rFonts w:ascii="Times New Roman" w:hAnsi="Times New Roman" w:cs="Times New Roman"/>
+          <w:b/>
+          <w:bCs/>
+        </w:rPr>
+        <w:t>A)</w:t>
+      </w:r>
+      <w:r>
+        <w:rPr>
+          <w:rFonts w:ascii="Times New Roman" w:hAnsi="Times New Roman" w:cs="Times New Roman"/>
+        </w:rPr>
+        <w:t xml:space="preserve"> Three major river systems in Western Alaska, the Yukon (Blue), Kuskokwim (Red), and Nushagak (Green) watersheds. Black circles indicate sampling locations for otolith collection (and genetic collection in the Yukon) on each river. </w:t>
+      </w:r>
+    </w:p>
+    <w:p>
+      <w:pPr>
+        <w:rPr>
+          <w:rFonts w:ascii="Times New Roman" w:hAnsi="Times New Roman" w:cs="Times New Roman"/>
+        </w:rPr>
+      </w:pPr>
+      <w:r>
+        <w:rPr>
+          <w:rFonts w:ascii="Times New Roman" w:hAnsi="Times New Roman" w:cs="Times New Roman"/>
+          <w:b/>
+          <w:bCs/>
+        </w:rPr>
+        <w:t>B)</w:t>
+      </w:r>
+      <w:r>
+        <w:rPr>
+          <w:rFonts w:ascii="Times New Roman" w:hAnsi="Times New Roman" w:cs="Times New Roman"/>
+        </w:rPr>
+        <w:t xml:space="preserve"> ⁸⁷Sr/⁸⁶Sr </w:t>
+      </w:r>
+      <w:proofErr w:type="spellStart"/>
+      <w:r>
+        <w:rPr>
+          <w:rFonts w:ascii="Times New Roman" w:hAnsi="Times New Roman" w:cs="Times New Roman"/>
+        </w:rPr>
+        <w:t>i</w:t>
+      </w:r>
+      <w:r>
+        <w:rPr>
+          <w:rFonts w:ascii="Times New Roman" w:hAnsi="Times New Roman" w:cs="Times New Roman"/>
+        </w:rPr>
+        <w:t>soscape</w:t>
+      </w:r>
+      <w:proofErr w:type="spellEnd"/>
+      <w:r>
+        <w:rPr>
+          <w:rFonts w:ascii="Times New Roman" w:hAnsi="Times New Roman" w:cs="Times New Roman"/>
+        </w:rPr>
+        <w:t xml:space="preserve"> of all three river-basins. Values range from 0.702 to 0.740, with darker </w:t>
+      </w:r>
+      <w:proofErr w:type="spellStart"/>
+      <w:r>
+        <w:rPr>
+          <w:rFonts w:ascii="Times New Roman" w:hAnsi="Times New Roman" w:cs="Times New Roman"/>
+        </w:rPr>
+        <w:t>colour</w:t>
+      </w:r>
+      <w:r>
+        <w:rPr>
+          <w:rFonts w:ascii="Times New Roman" w:hAnsi="Times New Roman" w:cs="Times New Roman"/>
+        </w:rPr>
+        <w:t>s</w:t>
+      </w:r>
+      <w:proofErr w:type="spellEnd"/>
+      <w:r>
+        <w:rPr>
+          <w:rFonts w:ascii="Times New Roman" w:hAnsi="Times New Roman" w:cs="Times New Roman"/>
+        </w:rPr>
+        <w:t xml:space="preserve"> indicate more enriched values whereas lighter </w:t>
+      </w:r>
+      <w:proofErr w:type="spellStart"/>
+      <w:r>
+        <w:rPr>
+          <w:rFonts w:ascii="Times New Roman" w:hAnsi="Times New Roman" w:cs="Times New Roman"/>
+        </w:rPr>
+        <w:t>colour</w:t>
+      </w:r>
+      <w:r>
+        <w:rPr>
+          <w:rFonts w:ascii="Times New Roman" w:hAnsi="Times New Roman" w:cs="Times New Roman"/>
+        </w:rPr>
+        <w:t>s</w:t>
+      </w:r>
+      <w:proofErr w:type="spellEnd"/>
+      <w:r>
+        <w:rPr>
+          <w:rFonts w:ascii="Times New Roman" w:hAnsi="Times New Roman" w:cs="Times New Roman"/>
+        </w:rPr>
+        <w:t xml:space="preserve"> indicate less enriched.  </w:t>
+      </w:r>
+    </w:p>
+    <w:p>
+      <w:pPr>
+        <w:rPr>
+          <w:rFonts w:ascii="Garamond" w:hAnsi="Garamond"/>
+          <w:b/>
+          <w:bCs/>
+          <w:sz w:val="16"/>
+          <w:szCs w:val="16"/>
+        </w:rPr>
+      </w:pPr>
+    </w:p>
+    <w:p>
+      <w:pPr>
+        <w:rPr>
+          <w:rFonts w:ascii="Times New Roman" w:hAnsi="Times New Roman" w:cs="Times New Roman"/>
+          <w:b/>
+          <w:bCs/>
+          <w:sz w:val="16"/>
+          <w:szCs w:val="16"/>
+        </w:rPr>
+      </w:pPr>
+      <w:r>
+        <w:rPr>
+          <w:rFonts w:ascii="Garamond" w:hAnsi="Garamond"/>
+          <w:noProof/>
+          <w:sz w:val="16"/>
+          <w:szCs w:val="16"/>
+        </w:rPr>
+        <w:lastRenderedPageBreak/>
+        <w:drawing>
+          <wp:anchor distT="0" distB="0" distL="114300" distR="114300" simplePos="0" relativeHeight="251659264" behindDoc="0" locked="0" layoutInCell="1" allowOverlap="1" wp14:anchorId="7418A9E9" wp14:editId="7D171D47">
+            <wp:simplePos x="0" y="0"/>
+            <wp:positionH relativeFrom="column">
+              <wp:posOffset>-194945</wp:posOffset>
+            </wp:positionH>
+            <wp:positionV relativeFrom="paragraph">
+              <wp:posOffset>0</wp:posOffset>
+            </wp:positionV>
+            <wp:extent cx="4540250" cy="3783965"/>
+            <wp:effectExtent l="0" t="0" r="6350" b="635"/>
+            <wp:wrapSquare wrapText="bothSides"/>
+            <wp:docPr id="2003545803" name="Picture 1" descr="A diagram of a diagram&#10;&#10;AI-generated content may be incorrect."/>
+            <wp:cNvGraphicFramePr>
+              <a:graphicFrameLocks xmlns:a="http://schemas.openxmlformats.org/drawingml/2006/main" noChangeAspect="1"/>
+            </wp:cNvGraphicFramePr>
+            <a:graphic xmlns:a="http://schemas.openxmlformats.org/drawingml/2006/main">
+              <a:graphicData uri="http://schemas.openxmlformats.org/drawingml/2006/picture">
+                <pic:pic xmlns:pic="http://schemas.openxmlformats.org/drawingml/2006/picture">
+                  <pic:nvPicPr>
+                    <pic:cNvPr id="2003545803" name="Picture 1" descr="A diagram of a diagram&#10;&#10;AI-generated content may be incorrect."/>
+                    <pic:cNvPicPr/>
+                  </pic:nvPicPr>
+                  <pic:blipFill>
+                    <a:blip r:embed="rId8" cstate="print">
+                      <a:extLst>
+                        <a:ext uri="{28A0092B-C50C-407E-A947-70E740481C1C}">
+                          <a14:useLocalDpi xmlns:a14="http://schemas.microsoft.com/office/drawing/2010/main" val="0"/>
+                        </a:ext>
+                      </a:extLst>
+                    </a:blip>
+                    <a:stretch>
+                      <a:fillRect/>
+                    </a:stretch>
+                  </pic:blipFill>
+                  <pic:spPr>
+                    <a:xfrm>
+                      <a:off x="0" y="0"/>
+                      <a:ext cx="4540250" cy="3783965"/>
+                    </a:xfrm>
+                    <a:prstGeom prst="rect">
+                      <a:avLst/>
+                    </a:prstGeom>
+                  </pic:spPr>
+                </pic:pic>
+              </a:graphicData>
+            </a:graphic>
+            <wp14:sizeRelH relativeFrom="page">
+              <wp14:pctWidth>0</wp14:pctWidth>
+            </wp14:sizeRelH>
+            <wp14:sizeRelV relativeFrom="page">
+              <wp14:pctHeight>0</wp14:pctHeight>
+            </wp14:sizeRelV>
+          </wp:anchor>
+        </w:drawing>
+      </w:r>
+    </w:p>
+    <w:p>
+      <w:pPr>
+        <w:rPr>
+          <w:rFonts w:ascii="Times New Roman" w:hAnsi="Times New Roman" w:cs="Times New Roman"/>
+          <w:b/>
+          <w:bCs/>
+        </w:rPr>
+      </w:pPr>
+    </w:p>
+    <w:p>
+      <w:pPr>
+        <w:rPr>
+          <w:rFonts w:ascii="Times New Roman" w:hAnsi="Times New Roman" w:cs="Times New Roman"/>
+          <w:b/>
+          <w:bCs/>
+        </w:rPr>
+      </w:pPr>
+    </w:p>
+    <w:p>
+      <w:pPr>
+        <w:rPr>
+          <w:rFonts w:ascii="Times New Roman" w:hAnsi="Times New Roman" w:cs="Times New Roman"/>
+          <w:b/>
+          <w:bCs/>
+        </w:rPr>
+      </w:pPr>
+    </w:p>
+    <w:p>
+      <w:pPr>
+        <w:rPr>
+          <w:rFonts w:ascii="Times New Roman" w:hAnsi="Times New Roman" w:cs="Times New Roman"/>
+          <w:b/>
+          <w:bCs/>
+        </w:rPr>
+      </w:pPr>
+    </w:p>
+    <w:p>
+      <w:pPr>
+        <w:rPr>
+          <w:rFonts w:ascii="Times New Roman" w:hAnsi="Times New Roman" w:cs="Times New Roman"/>
+          <w:b/>
+          <w:bCs/>
+        </w:rPr>
+      </w:pPr>
+    </w:p>
+    <w:p>
+      <w:pPr>
+        <w:rPr>
+          <w:rFonts w:ascii="Times New Roman" w:hAnsi="Times New Roman" w:cs="Times New Roman"/>
+          <w:b/>
+          <w:bCs/>
+        </w:rPr>
+      </w:pPr>
+    </w:p>
+    <w:p>
+      <w:pPr>
+        <w:rPr>
+          <w:rFonts w:ascii="Times New Roman" w:hAnsi="Times New Roman" w:cs="Times New Roman"/>
+          <w:b/>
+          <w:bCs/>
+        </w:rPr>
+      </w:pPr>
+    </w:p>
+    <w:p>
+      <w:pPr>
+        <w:rPr>
+          <w:rFonts w:ascii="Times New Roman" w:hAnsi="Times New Roman" w:cs="Times New Roman"/>
+          <w:b/>
+          <w:bCs/>
+        </w:rPr>
+      </w:pPr>
+    </w:p>
+    <w:p>
+      <w:pPr>
+        <w:rPr>
+          <w:rFonts w:ascii="Times New Roman" w:hAnsi="Times New Roman" w:cs="Times New Roman"/>
+          <w:b/>
+          <w:bCs/>
+        </w:rPr>
+      </w:pPr>
+    </w:p>
+    <w:p>
+      <w:pPr>
+        <w:rPr>
+          <w:rFonts w:ascii="Times New Roman" w:hAnsi="Times New Roman" w:cs="Times New Roman"/>
+          <w:b/>
+          <w:bCs/>
+        </w:rPr>
+      </w:pPr>
+    </w:p>
+    <w:p>
+      <w:pPr>
+        <w:rPr>
+          <w:rFonts w:ascii="Times New Roman" w:hAnsi="Times New Roman" w:cs="Times New Roman"/>
+          <w:b/>
+          <w:bCs/>
+        </w:rPr>
+      </w:pPr>
+    </w:p>
+    <w:p>
+      <w:pPr>
+        <w:rPr>
+          <w:rFonts w:ascii="Times New Roman" w:hAnsi="Times New Roman" w:cs="Times New Roman"/>
+          <w:b/>
+          <w:bCs/>
+        </w:rPr>
+      </w:pPr>
+    </w:p>
+    <w:p>
+      <w:pPr>
+        <w:rPr>
+          <w:rFonts w:ascii="Times New Roman" w:hAnsi="Times New Roman" w:cs="Times New Roman"/>
+          <w:b/>
+          <w:bCs/>
+        </w:rPr>
+      </w:pPr>
+    </w:p>
+    <w:p>
+      <w:pPr>
+        <w:rPr>
+          <w:rFonts w:ascii="Times New Roman" w:hAnsi="Times New Roman" w:cs="Times New Roman"/>
+        </w:rPr>
+      </w:pPr>
+      <w:r>
+        <w:rPr>
+          <w:rFonts w:ascii="Times New Roman" w:hAnsi="Times New Roman" w:cs="Times New Roman"/>
+          <w:b/>
+          <w:bCs/>
+        </w:rPr>
+        <w:t>Figure 2:</w:t>
+      </w:r>
+      <w:r>
+        <w:rPr>
+          <w:rFonts w:ascii="Times New Roman" w:hAnsi="Times New Roman" w:cs="Times New Roman"/>
+        </w:rPr>
+        <w:t xml:space="preserve"> Principal Component analysis of GAM smoothed timeseries data (n = 2,531 otoliths). Significant clustering is evident, but with overlap between all watersheds. Yukon (Blue points) contain a much larger range of values, indicative of the large range in natal ⁸⁷Sr/⁸⁶Sr values in the basin. Kuskokwim (Red points) overlap between both Nushagak and Yukon fish, likely due to its position in the region between both watersheds. </w:t>
+      </w:r>
+    </w:p>
+    <w:p>
+      <w:pPr>
+        <w:rPr>
+          <w:rFonts w:ascii="Garamond" w:hAnsi="Garamond"/>
+          <w:b/>
+          <w:bCs/>
+          <w:sz w:val="16"/>
+          <w:szCs w:val="16"/>
+        </w:rPr>
+      </w:pPr>
+    </w:p>
+    <w:p>
+      <w:pPr>
+        <w:rPr>
+          <w:rFonts w:ascii="Garamond" w:hAnsi="Garamond"/>
+          <w:b/>
+          <w:bCs/>
+          <w:sz w:val="16"/>
+          <w:szCs w:val="16"/>
+        </w:rPr>
+      </w:pPr>
+      <w:r>
+        <w:rPr>
+          <w:rFonts w:ascii="Garamond" w:hAnsi="Garamond"/>
+          <w:b/>
+          <w:bCs/>
+          <w:noProof/>
+          <w:sz w:val="16"/>
+          <w:szCs w:val="16"/>
+        </w:rPr>
+        <w:lastRenderedPageBreak/>
+        <w:drawing>
+          <wp:inline distT="0" distB="0" distL="0" distR="0" wp14:anchorId="0881EB77" wp14:editId="7B32F3D7">
+            <wp:extent cx="5943600" cy="2931160"/>
+            <wp:effectExtent l="0" t="0" r="0" b="2540"/>
+            <wp:docPr id="1216485611" name="Picture 3" descr="A graph of a diagram&#10;&#10;AI-generated content may be incorrect."/>
+            <wp:cNvGraphicFramePr>
+              <a:graphicFrameLocks xmlns:a="http://schemas.openxmlformats.org/drawingml/2006/main" noChangeAspect="1"/>
+            </wp:cNvGraphicFramePr>
+            <a:graphic xmlns:a="http://schemas.openxmlformats.org/drawingml/2006/main">
+              <a:graphicData uri="http://schemas.openxmlformats.org/drawingml/2006/picture">
+                <pic:pic xmlns:pic="http://schemas.openxmlformats.org/drawingml/2006/picture">
+                  <pic:nvPicPr>
+                    <pic:cNvPr id="1216485611" name="Picture 3" descr="A graph of a diagram&#10;&#10;AI-generated content may be incorrect."/>
+                    <pic:cNvPicPr/>
+                  </pic:nvPicPr>
+                  <pic:blipFill>
+                    <a:blip r:embed="rId9" cstate="print">
+                      <a:extLst>
+                        <a:ext uri="{28A0092B-C50C-407E-A947-70E740481C1C}">
+                          <a14:useLocalDpi xmlns:a14="http://schemas.microsoft.com/office/drawing/2010/main" val="0"/>
+                        </a:ext>
+                      </a:extLst>
+                    </a:blip>
+                    <a:stretch>
+                      <a:fillRect/>
+                    </a:stretch>
+                  </pic:blipFill>
+                  <pic:spPr>
+                    <a:xfrm>
+                      <a:off x="0" y="0"/>
+                      <a:ext cx="5943600" cy="2931160"/>
+                    </a:xfrm>
+                    <a:prstGeom prst="rect">
+                      <a:avLst/>
+                    </a:prstGeom>
+                  </pic:spPr>
+                </pic:pic>
+              </a:graphicData>
+            </a:graphic>
+          </wp:inline>
+        </w:drawing>
+      </w:r>
+    </w:p>
+    <w:p>
+      <w:pPr>
+        <w:rPr>
+          <w:rFonts w:ascii="Times New Roman" w:hAnsi="Times New Roman" w:cs="Times New Roman"/>
+        </w:rPr>
+      </w:pPr>
+      <w:r>
+        <w:rPr>
+          <w:rFonts w:ascii="Times New Roman" w:hAnsi="Times New Roman" w:cs="Times New Roman"/>
+          <w:b/>
+          <w:bCs/>
+        </w:rPr>
+        <w:t xml:space="preserve">Figure 3: </w:t>
+      </w:r>
+      <w:r>
+        <w:rPr>
+          <w:rFonts w:ascii="Times New Roman" w:hAnsi="Times New Roman" w:cs="Times New Roman"/>
+        </w:rPr>
+        <w:t xml:space="preserve">A) Principal component analysis of all samples with a natal origin ⁸⁷Sr/⁸⁶Sr of 0.7080 - 0.7085. Clustering among watersheds is evident between principal components 1 and 2 (68.39% of variance), as well as between principal components 2 and 3 (31.16% of variance). There is some overlap between all three watersheds in both cases. B) Sample otolith LA timeseries </w:t>
+      </w:r>
+      <w:r>
+        <w:rPr>
+          <w:rFonts w:ascii="Times New Roman" w:hAnsi="Times New Roman" w:cs="Times New Roman"/>
+        </w:rPr>
+        <w:t>colore</w:t>
+      </w:r>
+      <w:r>
+        <w:rPr>
+          <w:rFonts w:ascii="Times New Roman" w:hAnsi="Times New Roman" w:cs="Times New Roman"/>
+        </w:rPr>
+        <w:t>d by the absolute value of the PCA loadings at associated timeseries indices. PC1 (top row) shows high loading on the middle section of the timeseries after the natal origin region. PC2 is driven by the region of the timeseries towards the marine entry, likely the result of mainstem migration to the ocean. Separation along PC3 is driven by the very beginning of the timeseries, which is the region associated with the natal origin. Notably, Yukon individuals from the CWAK region contain a less pronounces mainstem signal as compared to their counterpart from the upper or middle Yukon genetic groups.</w:t>
+      </w:r>
+    </w:p>
+    <w:p>
+      <w:pPr>
+        <w:rPr>
+          <w:rFonts w:ascii="Garamond" w:hAnsi="Garamond"/>
+          <w:b/>
+          <w:bCs/>
+          <w:sz w:val="16"/>
+          <w:szCs w:val="16"/>
+        </w:rPr>
+      </w:pPr>
+    </w:p>
+    <w:p>
+      <w:pPr>
+        <w:rPr>
+          <w:rFonts w:ascii="Garamond" w:hAnsi="Garamond"/>
+          <w:b/>
+          <w:bCs/>
+          <w:sz w:val="16"/>
+          <w:szCs w:val="16"/>
+        </w:rPr>
+      </w:pPr>
+    </w:p>
+    <w:p>
+      <w:pPr>
+        <w:rPr>
+          <w:rFonts w:ascii="Garamond" w:hAnsi="Garamond"/>
+          <w:b/>
+          <w:bCs/>
+          <w:sz w:val="16"/>
+          <w:szCs w:val="16"/>
+        </w:rPr>
+      </w:pPr>
+    </w:p>
+    <w:p>
+      <w:pPr>
+        <w:rPr>
+          <w:rFonts w:ascii="Garamond" w:hAnsi="Garamond"/>
+          <w:b/>
+          <w:bCs/>
+          <w:sz w:val="16"/>
+          <w:szCs w:val="16"/>
+        </w:rPr>
+      </w:pPr>
+    </w:p>
+    <w:p>
+      <w:pPr>
+        <w:rPr>
+          <w:rFonts w:ascii="Garamond" w:hAnsi="Garamond"/>
+          <w:b/>
+          <w:bCs/>
+          <w:sz w:val="16"/>
+          <w:szCs w:val="16"/>
+        </w:rPr>
+      </w:pPr>
+    </w:p>
+    <w:p>
+      <w:pPr>
+        <w:rPr>
+          <w:rFonts w:ascii="Garamond" w:hAnsi="Garamond"/>
+          <w:b/>
+          <w:bCs/>
+          <w:sz w:val="16"/>
+          <w:szCs w:val="16"/>
+        </w:rPr>
+      </w:pPr>
+    </w:p>
+    <w:p>
+      <w:pPr>
+        <w:rPr>
+          <w:rFonts w:ascii="Garamond" w:hAnsi="Garamond"/>
+          <w:b/>
+          <w:bCs/>
+          <w:sz w:val="16"/>
+          <w:szCs w:val="16"/>
+        </w:rPr>
+      </w:pPr>
+      <w:r>
+        <w:rPr>
+          <w:rFonts w:ascii="Garamond" w:hAnsi="Garamond"/>
+          <w:b/>
+          <w:bCs/>
+          <w:noProof/>
+          <w:sz w:val="16"/>
+          <w:szCs w:val="16"/>
+        </w:rPr>
+        <w:lastRenderedPageBreak/>
+        <w:drawing>
+          <wp:inline distT="0" distB="0" distL="0" distR="0" wp14:anchorId="6CC18779" wp14:editId="57771D46">
+            <wp:extent cx="5728137" cy="1718441"/>
+            <wp:effectExtent l="0" t="0" r="0" b="0"/>
+            <wp:docPr id="771740324" name="Picture 4"/>
+            <wp:cNvGraphicFramePr>
+              <a:graphicFrameLocks xmlns:a="http://schemas.openxmlformats.org/drawingml/2006/main" noChangeAspect="1"/>
+            </wp:cNvGraphicFramePr>
+            <a:graphic xmlns:a="http://schemas.openxmlformats.org/drawingml/2006/main">
+              <a:graphicData uri="http://schemas.openxmlformats.org/drawingml/2006/picture">
+                <pic:pic xmlns:pic="http://schemas.openxmlformats.org/drawingml/2006/picture">
+                  <pic:nvPicPr>
+                    <pic:cNvPr id="771740324" name="Picture 771740324"/>
+                    <pic:cNvPicPr/>
+                  </pic:nvPicPr>
+                  <pic:blipFill>
+                    <a:blip r:embed="rId10"/>
+                    <a:stretch>
+                      <a:fillRect/>
+                    </a:stretch>
+                  </pic:blipFill>
+                  <pic:spPr>
+                    <a:xfrm>
+                      <a:off x="0" y="0"/>
+                      <a:ext cx="5780272" cy="1734081"/>
+                    </a:xfrm>
+                    <a:prstGeom prst="rect">
+                      <a:avLst/>
+                    </a:prstGeom>
+                  </pic:spPr>
+                </pic:pic>
+              </a:graphicData>
+            </a:graphic>
+          </wp:inline>
+        </w:drawing>
+      </w:r>
+    </w:p>
+    <w:p>
+      <w:pPr>
+        <w:rPr>
+          <w:rFonts w:ascii="Times New Roman" w:hAnsi="Times New Roman" w:cs="Times New Roman"/>
+        </w:rPr>
+      </w:pPr>
+      <w:r>
+        <w:rPr>
+          <w:rFonts w:ascii="Times New Roman" w:hAnsi="Times New Roman" w:cs="Times New Roman"/>
+          <w:b/>
+          <w:bCs/>
+        </w:rPr>
+        <w:t>Figure 4:</w:t>
+      </w:r>
+      <w:r>
+        <w:rPr>
+          <w:rFonts w:ascii="Times New Roman" w:hAnsi="Times New Roman" w:cs="Times New Roman"/>
+        </w:rPr>
+        <w:t xml:space="preserve"> Model Performance comparison among data preprocessing steps and model types. Accuracy indicates the proportion of each class correctly classified. F1-Score is the harmonic mean of precision and recall, providing a balanced performance measure across all watershed classes. Results compare two ⁸⁷Sr/⁸⁶Sr timeseries smoothing methods (GAM, MA) and three machine learning algorithms (Random Forest, SVM, KNN) using either all test data (Total) or only overlapping isotope ranges </w:t>
+      </w:r>
+      <w:r>
+        <w:rPr>
+          <w:rFonts w:ascii="Times New Roman" w:hAnsi="Times New Roman" w:cs="Times New Roman"/>
+        </w:rPr>
+        <w:t>(Restricted</w:t>
+      </w:r>
+      <w:r>
+        <w:rPr>
+          <w:rFonts w:ascii="Times New Roman" w:hAnsi="Times New Roman" w:cs="Times New Roman"/>
+        </w:rPr>
+        <w:t xml:space="preserve">). Darker green </w:t>
+      </w:r>
+      <w:proofErr w:type="spellStart"/>
+      <w:r>
+        <w:rPr>
+          <w:rFonts w:ascii="Times New Roman" w:hAnsi="Times New Roman" w:cs="Times New Roman"/>
+        </w:rPr>
+        <w:t>colour</w:t>
+      </w:r>
+      <w:r>
+        <w:rPr>
+          <w:rFonts w:ascii="Times New Roman" w:hAnsi="Times New Roman" w:cs="Times New Roman"/>
+        </w:rPr>
+        <w:t>s</w:t>
+      </w:r>
+      <w:proofErr w:type="spellEnd"/>
+      <w:r>
+        <w:rPr>
+          <w:rFonts w:ascii="Times New Roman" w:hAnsi="Times New Roman" w:cs="Times New Roman"/>
+        </w:rPr>
+        <w:t xml:space="preserve"> indicate higher scores.</w:t>
+      </w:r>
+    </w:p>
+    <w:p>
+      <w:pPr>
+        <w:rPr>
+          <w:rFonts w:ascii="Garamond" w:hAnsi="Garamond"/>
+          <w:sz w:val="16"/>
+          <w:szCs w:val="16"/>
+        </w:rPr>
+      </w:pPr>
+    </w:p>
+    <w:p>
+      <w:pPr>
+        <w:rPr>
+          <w:rFonts w:ascii="Garamond" w:hAnsi="Garamond"/>
+          <w:sz w:val="16"/>
+          <w:szCs w:val="16"/>
+        </w:rPr>
+      </w:pPr>
+    </w:p>
+    <w:p>
+      <w:pPr>
+        <w:rPr>
+          <w:rFonts w:ascii="Garamond" w:hAnsi="Garamond"/>
+          <w:sz w:val="16"/>
+          <w:szCs w:val="16"/>
+        </w:rPr>
+      </w:pPr>
+    </w:p>
+    <w:p>
+      <w:pPr>
+        <w:rPr>
+          <w:rFonts w:ascii="Garamond" w:hAnsi="Garamond"/>
+          <w:sz w:val="16"/>
+          <w:szCs w:val="16"/>
+        </w:rPr>
+      </w:pPr>
+    </w:p>
+    <w:p>
+      <w:pPr>
+        <w:rPr>
+          <w:rFonts w:ascii="Garamond" w:hAnsi="Garamond"/>
+          <w:sz w:val="16"/>
+          <w:szCs w:val="16"/>
+        </w:rPr>
+      </w:pPr>
+    </w:p>
+    <w:p>
+      <w:pPr>
+        <w:rPr>
+          <w:rFonts w:ascii="Garamond" w:hAnsi="Garamond"/>
+          <w:sz w:val="16"/>
+          <w:szCs w:val="16"/>
+        </w:rPr>
+      </w:pPr>
+    </w:p>
+    <w:p>
+      <w:pPr>
+        <w:rPr>
+          <w:rFonts w:ascii="Garamond" w:hAnsi="Garamond"/>
+          <w:sz w:val="16"/>
+          <w:szCs w:val="16"/>
+        </w:rPr>
+      </w:pPr>
+    </w:p>
+    <w:p>
+      <w:pPr>
+        <w:rPr>
+          <w:rFonts w:ascii="Garamond" w:hAnsi="Garamond"/>
+          <w:sz w:val="16"/>
+          <w:szCs w:val="16"/>
+        </w:rPr>
+      </w:pPr>
+    </w:p>
+    <w:p>
+      <w:pPr>
+        <w:rPr>
+          <w:rFonts w:ascii="Garamond" w:hAnsi="Garamond"/>
+          <w:sz w:val="16"/>
+          <w:szCs w:val="16"/>
+        </w:rPr>
+      </w:pPr>
+    </w:p>
+    <w:p>
+      <w:pPr>
+        <w:rPr>
+          <w:rFonts w:ascii="Garamond" w:hAnsi="Garamond"/>
+          <w:sz w:val="16"/>
+          <w:szCs w:val="16"/>
+        </w:rPr>
+      </w:pPr>
+    </w:p>
+    <w:p>
+      <w:pPr>
+        <w:rPr>
+          <w:rFonts w:ascii="Garamond" w:hAnsi="Garamond"/>
+          <w:sz w:val="16"/>
+          <w:szCs w:val="16"/>
+        </w:rPr>
+      </w:pPr>
+    </w:p>
+    <w:p>
+      <w:pPr>
+        <w:rPr>
+          <w:rFonts w:ascii="Garamond" w:hAnsi="Garamond"/>
+          <w:sz w:val="16"/>
+          <w:szCs w:val="16"/>
+        </w:rPr>
+      </w:pPr>
+    </w:p>
+    <w:p>
+      <w:pPr>
+        <w:rPr>
+          <w:rFonts w:ascii="Garamond" w:hAnsi="Garamond"/>
+          <w:sz w:val="16"/>
+          <w:szCs w:val="16"/>
+        </w:rPr>
+      </w:pPr>
+      <w:r>
+        <w:rPr>
+          <w:rFonts w:ascii="Garamond" w:hAnsi="Garamond"/>
+          <w:noProof/>
+          <w:sz w:val="16"/>
+          <w:szCs w:val="16"/>
+        </w:rPr>
+        <w:lastRenderedPageBreak/>
+        <w:drawing>
+          <wp:inline distT="0" distB="0" distL="0" distR="0" wp14:anchorId="0FAAEB10" wp14:editId="2B08761E">
+            <wp:extent cx="5943600" cy="2971800"/>
+            <wp:effectExtent l="0" t="0" r="0" b="0"/>
+            <wp:docPr id="2074281953" name="Picture 1"/>
+            <wp:cNvGraphicFramePr>
+              <a:graphicFrameLocks xmlns:a="http://schemas.openxmlformats.org/drawingml/2006/main" noChangeAspect="1"/>
+            </wp:cNvGraphicFramePr>
+            <a:graphic xmlns:a="http://schemas.openxmlformats.org/drawingml/2006/main">
+              <a:graphicData uri="http://schemas.openxmlformats.org/drawingml/2006/picture">
+                <pic:pic xmlns:pic="http://schemas.openxmlformats.org/drawingml/2006/picture">
+                  <pic:nvPicPr>
+                    <pic:cNvPr id="2074281953" name="Picture 2074281953"/>
+                    <pic:cNvPicPr/>
+                  </pic:nvPicPr>
+                  <pic:blipFill>
+                    <a:blip r:embed="rId11"/>
+                    <a:stretch>
+                      <a:fillRect/>
+                    </a:stretch>
+                  </pic:blipFill>
+                  <pic:spPr>
+                    <a:xfrm>
+                      <a:off x="0" y="0"/>
+                      <a:ext cx="5943600" cy="2971800"/>
+                    </a:xfrm>
+                    <a:prstGeom prst="rect">
+                      <a:avLst/>
+                    </a:prstGeom>
+                  </pic:spPr>
+                </pic:pic>
+              </a:graphicData>
+            </a:graphic>
+          </wp:inline>
+        </w:drawing>
+      </w:r>
+      <w:r>
+        <w:rPr>
+          <w:rFonts w:ascii="Garamond" w:hAnsi="Garamond"/>
+          <w:sz w:val="16"/>
+          <w:szCs w:val="16"/>
+        </w:rPr>
+        <w:t xml:space="preserve"> </w:t>
+      </w:r>
+    </w:p>
+    <w:p>
+      <w:pPr>
+        <w:rPr>
+          <w:rFonts w:ascii="Times New Roman" w:hAnsi="Times New Roman" w:cs="Times New Roman"/>
+        </w:rPr>
+      </w:pPr>
+      <w:r>
+        <w:rPr>
+          <w:rFonts w:ascii="Times New Roman" w:hAnsi="Times New Roman" w:cs="Times New Roman"/>
+          <w:b/>
+          <w:bCs/>
+        </w:rPr>
+        <w:t>Figure 5:</w:t>
+      </w:r>
+      <w:r>
+        <w:rPr>
+          <w:rFonts w:ascii="Times New Roman" w:hAnsi="Times New Roman" w:cs="Times New Roman"/>
+        </w:rPr>
+        <w:t xml:space="preserve"> Confusion matrix from the highest performing model (Random Forest on GAM Smoothed data) for both total test set and overlapping subset. Boxes along the horizontal axis indicate correctly classified individuals (red). Vertical axis labels are the actual watershed labels whereas horizontal labels are the predicted class from the model. Percentages indicate the percent of the actual class identified as the predicted class and numbers indicate the number of the actual class assigned to the predicted class. </w:t>
+      </w:r>
+    </w:p>
+    <w:p>
+      <w:pPr>
+        <w:rPr>
+          <w:rFonts w:ascii="Garamond" w:hAnsi="Garamond"/>
+          <w:b/>
+          <w:bCs/>
+          <w:sz w:val="16"/>
+          <w:szCs w:val="16"/>
+        </w:rPr>
+      </w:pPr>
+    </w:p>
+    <w:p>
+      <w:pPr>
+        <w:rPr>
+          <w:rFonts w:ascii="Garamond" w:hAnsi="Garamond"/>
+          <w:b/>
+          <w:bCs/>
+          <w:sz w:val="16"/>
+          <w:szCs w:val="16"/>
+        </w:rPr>
+      </w:pPr>
+    </w:p>
+    <w:p>
+      <w:pPr>
+        <w:rPr>
+          <w:rFonts w:ascii="Garamond" w:hAnsi="Garamond"/>
+          <w:b/>
+          <w:bCs/>
+          <w:sz w:val="16"/>
+          <w:szCs w:val="16"/>
+        </w:rPr>
+      </w:pPr>
+    </w:p>
+    <w:p>
+      <w:pPr>
+        <w:rPr>
+          <w:rFonts w:ascii="Garamond" w:hAnsi="Garamond"/>
+          <w:b/>
+          <w:bCs/>
+          <w:sz w:val="16"/>
+          <w:szCs w:val="16"/>
+        </w:rPr>
+      </w:pPr>
+    </w:p>
+    <w:p>
+      <w:pPr>
+        <w:rPr>
+          <w:rFonts w:ascii="Garamond" w:hAnsi="Garamond"/>
+          <w:b/>
+          <w:bCs/>
+          <w:sz w:val="16"/>
+          <w:szCs w:val="16"/>
+        </w:rPr>
+      </w:pPr>
+    </w:p>
+    <w:p>
+      <w:pPr>
+        <w:rPr>
+          <w:rFonts w:ascii="Garamond" w:hAnsi="Garamond"/>
+          <w:b/>
+          <w:bCs/>
+          <w:sz w:val="16"/>
+          <w:szCs w:val="16"/>
+        </w:rPr>
+      </w:pPr>
+      <w:r>
+        <w:rPr>
+          <w:rFonts w:ascii="Garamond" w:hAnsi="Garamond"/>
+          <w:b/>
+          <w:bCs/>
+          <w:noProof/>
+          <w:sz w:val="16"/>
+          <w:szCs w:val="16"/>
+        </w:rPr>
+        <w:lastRenderedPageBreak/>
+        <w:drawing>
+          <wp:inline distT="0" distB="0" distL="0" distR="0" wp14:anchorId="7EA8244D" wp14:editId="1385A226">
+            <wp:extent cx="6436658" cy="3218329"/>
+            <wp:effectExtent l="0" t="0" r="2540" b="0"/>
+            <wp:docPr id="2137096084" name="Picture 3" descr="A graph of different colored lines&#10;&#10;AI-generated content may be incorrect."/>
+            <wp:cNvGraphicFramePr>
+              <a:graphicFrameLocks xmlns:a="http://schemas.openxmlformats.org/drawingml/2006/main" noChangeAspect="1"/>
+            </wp:cNvGraphicFramePr>
+            <a:graphic xmlns:a="http://schemas.openxmlformats.org/drawingml/2006/main">
+              <a:graphicData uri="http://schemas.openxmlformats.org/drawingml/2006/picture">
+                <pic:pic xmlns:pic="http://schemas.openxmlformats.org/drawingml/2006/picture">
+                  <pic:nvPicPr>
+                    <pic:cNvPr id="2137096084" name="Picture 3" descr="A graph of different colored lines&#10;&#10;AI-generated content may be incorrect."/>
+                    <pic:cNvPicPr/>
+                  </pic:nvPicPr>
+                  <pic:blipFill>
+                    <a:blip r:embed="rId12" cstate="print">
+                      <a:extLst>
+                        <a:ext uri="{28A0092B-C50C-407E-A947-70E740481C1C}">
+                          <a14:useLocalDpi xmlns:a14="http://schemas.microsoft.com/office/drawing/2010/main" val="0"/>
+                        </a:ext>
+                      </a:extLst>
+                    </a:blip>
+                    <a:stretch>
+                      <a:fillRect/>
+                    </a:stretch>
+                  </pic:blipFill>
+                  <pic:spPr>
+                    <a:xfrm>
+                      <a:off x="0" y="0"/>
+                      <a:ext cx="6458905" cy="3229453"/>
+                    </a:xfrm>
+                    <a:prstGeom prst="rect">
+                      <a:avLst/>
+                    </a:prstGeom>
+                  </pic:spPr>
+                </pic:pic>
+              </a:graphicData>
+            </a:graphic>
+          </wp:inline>
+        </w:drawing>
+      </w:r>
+    </w:p>
+    <w:p>
+      <w:pPr>
+        <w:rPr>
+          <w:rFonts w:ascii="Times New Roman" w:hAnsi="Times New Roman" w:cs="Times New Roman"/>
+        </w:rPr>
+      </w:pPr>
+      <w:r>
+        <w:rPr>
+          <w:rFonts w:ascii="Times New Roman" w:hAnsi="Times New Roman" w:cs="Times New Roman"/>
+          <w:b/>
+          <w:bCs/>
+        </w:rPr>
+        <w:t xml:space="preserve">Figure 6: </w:t>
+      </w:r>
+      <w:r>
+        <w:rPr>
+          <w:rFonts w:ascii="Times New Roman" w:hAnsi="Times New Roman" w:cs="Times New Roman"/>
+        </w:rPr>
+        <w:t xml:space="preserve">Classification accuracy with different probability thresholds (60-90%). Points indicate the percentage of correctly classified individuals with a calibrated probability value above the given threshold value. Grey dashed lines represent the overall accuracy, whereas </w:t>
+      </w:r>
+      <w:r>
+        <w:rPr>
+          <w:rFonts w:ascii="Times New Roman" w:hAnsi="Times New Roman" w:cs="Times New Roman"/>
+        </w:rPr>
+        <w:t>colore</w:t>
+      </w:r>
+      <w:r>
+        <w:rPr>
+          <w:rFonts w:ascii="Times New Roman" w:hAnsi="Times New Roman" w:cs="Times New Roman"/>
+        </w:rPr>
+        <w:t xml:space="preserve">d lines illustrate the class-specific probability at that threshold </w:t>
+      </w:r>
+    </w:p>
+    <w:p>
+      <w:pPr>
+        <w:spacing w:before="100" w:beforeAutospacing="1" w:after="100" w:afterAutospacing="1" w:line="480" w:lineRule="auto"/>
+        <w:ind w:left="720" w:hanging="720"/>
+        <w:outlineLvl w:val="1"/>
+        <w:rPr>
+          <w:rFonts w:ascii="Garamond" w:hAnsi="Garamond"/>
+          <w:sz w:val="22"/>
+          <w:szCs w:val="22"/>
+        </w:rPr>
+      </w:pPr>
     </w:p>
     <w:p>
       <w:pPr>

</xml_diff>